<commit_message>
Compatible with version 2.1.1
</commit_message>
<xml_diff>
--- a/Looper Viewer User Manual.docx
+++ b/Looper Viewer User Manual.docx
@@ -125,8 +125,8 @@
             <w:ind w:left="0" w:leftChars="0" w:right="0" w:rightChars="0" w:firstLine="0" w:firstLineChars="0"/>
             <w:jc w:val="center"/>
           </w:pPr>
-          <w:bookmarkStart w:id="22" w:name="_GoBack"/>
-          <w:bookmarkEnd w:id="22"/>
+          <w:bookmarkStart w:id="24" w:name="_GoBack"/>
+          <w:bookmarkEnd w:id="24"/>
           <w:r>
             <w:rPr>
               <w:rFonts w:hint="eastAsia" w:ascii="宋体" w:hAnsi="宋体" w:eastAsia="宋体"/>
@@ -170,7 +170,7 @@
             <w:rPr>
               <w:rFonts w:hint="eastAsia" w:ascii="宋体" w:hAnsi="宋体" w:eastAsia="宋体" w:cs="宋体"/>
             </w:rPr>
-            <w:instrText xml:space="preserve"> HYPERLINK \l _Toc26413 </w:instrText>
+            <w:instrText xml:space="preserve"> HYPERLINK \l _Toc24160 </w:instrText>
           </w:r>
           <w:r>
             <w:rPr>
@@ -198,7 +198,7 @@
             <w:fldChar w:fldCharType="begin"/>
           </w:r>
           <w:r>
-            <w:instrText xml:space="preserve"> PAGEREF _Toc26413 \h </w:instrText>
+            <w:instrText xml:space="preserve"> PAGEREF _Toc24160 \h </w:instrText>
           </w:r>
           <w:r>
             <w:fldChar w:fldCharType="separate"/>
@@ -233,7 +233,7 @@
             <w:rPr>
               <w:rFonts w:hint="eastAsia" w:ascii="宋体" w:hAnsi="宋体" w:eastAsia="宋体" w:cs="宋体"/>
             </w:rPr>
-            <w:instrText xml:space="preserve"> HYPERLINK \l _Toc28917 </w:instrText>
+            <w:instrText xml:space="preserve"> HYPERLINK \l _Toc15297 </w:instrText>
           </w:r>
           <w:r>
             <w:rPr>
@@ -262,7 +262,7 @@
             <w:fldChar w:fldCharType="begin"/>
           </w:r>
           <w:r>
-            <w:instrText xml:space="preserve"> PAGEREF _Toc28917 \h </w:instrText>
+            <w:instrText xml:space="preserve"> PAGEREF _Toc15297 \h </w:instrText>
           </w:r>
           <w:r>
             <w:fldChar w:fldCharType="separate"/>
@@ -297,7 +297,7 @@
             <w:rPr>
               <w:rFonts w:hint="eastAsia" w:ascii="宋体" w:hAnsi="宋体" w:eastAsia="宋体" w:cs="宋体"/>
             </w:rPr>
-            <w:instrText xml:space="preserve"> HYPERLINK \l _Toc29235 </w:instrText>
+            <w:instrText xml:space="preserve"> HYPERLINK \l _Toc1558 </w:instrText>
           </w:r>
           <w:r>
             <w:rPr>
@@ -328,7 +328,7 @@
             <w:fldChar w:fldCharType="begin"/>
           </w:r>
           <w:r>
-            <w:instrText xml:space="preserve"> PAGEREF _Toc29235 \h </w:instrText>
+            <w:instrText xml:space="preserve"> PAGEREF _Toc1558 \h </w:instrText>
           </w:r>
           <w:r>
             <w:fldChar w:fldCharType="separate"/>
@@ -363,7 +363,7 @@
             <w:rPr>
               <w:rFonts w:hint="eastAsia" w:ascii="宋体" w:hAnsi="宋体" w:eastAsia="宋体" w:cs="宋体"/>
             </w:rPr>
-            <w:instrText xml:space="preserve"> HYPERLINK \l _Toc5871 </w:instrText>
+            <w:instrText xml:space="preserve"> HYPERLINK \l _Toc11804 </w:instrText>
           </w:r>
           <w:r>
             <w:rPr>
@@ -395,7 +395,7 @@
             <w:fldChar w:fldCharType="begin"/>
           </w:r>
           <w:r>
-            <w:instrText xml:space="preserve"> PAGEREF _Toc5871 \h </w:instrText>
+            <w:instrText xml:space="preserve"> PAGEREF _Toc11804 \h </w:instrText>
           </w:r>
           <w:r>
             <w:fldChar w:fldCharType="separate"/>
@@ -430,7 +430,7 @@
             <w:rPr>
               <w:rFonts w:hint="eastAsia" w:ascii="宋体" w:hAnsi="宋体" w:eastAsia="宋体" w:cs="宋体"/>
             </w:rPr>
-            <w:instrText xml:space="preserve"> HYPERLINK \l _Toc25288 </w:instrText>
+            <w:instrText xml:space="preserve"> HYPERLINK \l _Toc21931 </w:instrText>
           </w:r>
           <w:r>
             <w:rPr>
@@ -461,7 +461,7 @@
             <w:fldChar w:fldCharType="begin"/>
           </w:r>
           <w:r>
-            <w:instrText xml:space="preserve"> PAGEREF _Toc25288 \h </w:instrText>
+            <w:instrText xml:space="preserve"> PAGEREF _Toc21931 \h </w:instrText>
           </w:r>
           <w:r>
             <w:fldChar w:fldCharType="separate"/>
@@ -496,7 +496,7 @@
             <w:rPr>
               <w:rFonts w:hint="eastAsia" w:ascii="宋体" w:hAnsi="宋体" w:eastAsia="宋体" w:cs="宋体"/>
             </w:rPr>
-            <w:instrText xml:space="preserve"> HYPERLINK \l _Toc30402 </w:instrText>
+            <w:instrText xml:space="preserve"> HYPERLINK \l _Toc8718 </w:instrText>
           </w:r>
           <w:r>
             <w:rPr>
@@ -529,7 +529,7 @@
             <w:fldChar w:fldCharType="begin"/>
           </w:r>
           <w:r>
-            <w:instrText xml:space="preserve"> PAGEREF _Toc30402 \h </w:instrText>
+            <w:instrText xml:space="preserve"> PAGEREF _Toc8718 \h </w:instrText>
           </w:r>
           <w:r>
             <w:fldChar w:fldCharType="separate"/>
@@ -564,7 +564,7 @@
             <w:rPr>
               <w:rFonts w:hint="eastAsia" w:ascii="宋体" w:hAnsi="宋体" w:eastAsia="宋体" w:cs="宋体"/>
             </w:rPr>
-            <w:instrText xml:space="preserve"> HYPERLINK \l _Toc9009 </w:instrText>
+            <w:instrText xml:space="preserve"> HYPERLINK \l _Toc19937 </w:instrText>
           </w:r>
           <w:r>
             <w:rPr>
@@ -595,7 +595,7 @@
             <w:fldChar w:fldCharType="begin"/>
           </w:r>
           <w:r>
-            <w:instrText xml:space="preserve"> PAGEREF _Toc9009 \h </w:instrText>
+            <w:instrText xml:space="preserve"> PAGEREF _Toc19937 \h </w:instrText>
           </w:r>
           <w:r>
             <w:fldChar w:fldCharType="separate"/>
@@ -630,7 +630,7 @@
             <w:rPr>
               <w:rFonts w:hint="eastAsia" w:ascii="宋体" w:hAnsi="宋体" w:eastAsia="宋体" w:cs="宋体"/>
             </w:rPr>
-            <w:instrText xml:space="preserve"> HYPERLINK \l _Toc14339 </w:instrText>
+            <w:instrText xml:space="preserve"> HYPERLINK \l _Toc18655 </w:instrText>
           </w:r>
           <w:r>
             <w:rPr>
@@ -661,7 +661,7 @@
             <w:fldChar w:fldCharType="begin"/>
           </w:r>
           <w:r>
-            <w:instrText xml:space="preserve"> PAGEREF _Toc14339 \h </w:instrText>
+            <w:instrText xml:space="preserve"> PAGEREF _Toc18655 \h </w:instrText>
           </w:r>
           <w:r>
             <w:fldChar w:fldCharType="separate"/>
@@ -696,7 +696,7 @@
             <w:rPr>
               <w:rFonts w:hint="eastAsia" w:ascii="宋体" w:hAnsi="宋体" w:eastAsia="宋体" w:cs="宋体"/>
             </w:rPr>
-            <w:instrText xml:space="preserve"> HYPERLINK \l _Toc29088 </w:instrText>
+            <w:instrText xml:space="preserve"> HYPERLINK \l _Toc2095 </w:instrText>
           </w:r>
           <w:r>
             <w:rPr>
@@ -725,7 +725,7 @@
             <w:fldChar w:fldCharType="begin"/>
           </w:r>
           <w:r>
-            <w:instrText xml:space="preserve"> PAGEREF _Toc29088 \h </w:instrText>
+            <w:instrText xml:space="preserve"> PAGEREF _Toc2095 \h </w:instrText>
           </w:r>
           <w:r>
             <w:fldChar w:fldCharType="separate"/>
@@ -760,7 +760,7 @@
             <w:rPr>
               <w:rFonts w:hint="eastAsia" w:ascii="宋体" w:hAnsi="宋体" w:eastAsia="宋体" w:cs="宋体"/>
             </w:rPr>
-            <w:instrText xml:space="preserve"> HYPERLINK \l _Toc18751 </w:instrText>
+            <w:instrText xml:space="preserve"> HYPERLINK \l _Toc30288 </w:instrText>
           </w:r>
           <w:r>
             <w:rPr>
@@ -791,7 +791,7 @@
             <w:fldChar w:fldCharType="begin"/>
           </w:r>
           <w:r>
-            <w:instrText xml:space="preserve"> PAGEREF _Toc18751 \h </w:instrText>
+            <w:instrText xml:space="preserve"> PAGEREF _Toc30288 \h </w:instrText>
           </w:r>
           <w:r>
             <w:fldChar w:fldCharType="separate"/>
@@ -826,7 +826,7 @@
             <w:rPr>
               <w:rFonts w:hint="eastAsia" w:ascii="宋体" w:hAnsi="宋体" w:eastAsia="宋体" w:cs="宋体"/>
             </w:rPr>
-            <w:instrText xml:space="preserve"> HYPERLINK \l _Toc12016 </w:instrText>
+            <w:instrText xml:space="preserve"> HYPERLINK \l _Toc12523 </w:instrText>
           </w:r>
           <w:r>
             <w:rPr>
@@ -857,7 +857,7 @@
             <w:fldChar w:fldCharType="begin"/>
           </w:r>
           <w:r>
-            <w:instrText xml:space="preserve"> PAGEREF _Toc12016 \h </w:instrText>
+            <w:instrText xml:space="preserve"> PAGEREF _Toc12523 \h </w:instrText>
           </w:r>
           <w:r>
             <w:fldChar w:fldCharType="separate"/>
@@ -892,7 +892,7 @@
             <w:rPr>
               <w:rFonts w:hint="eastAsia" w:ascii="宋体" w:hAnsi="宋体" w:eastAsia="宋体" w:cs="宋体"/>
             </w:rPr>
-            <w:instrText xml:space="preserve"> HYPERLINK \l _Toc2657 </w:instrText>
+            <w:instrText xml:space="preserve"> HYPERLINK \l _Toc5775 </w:instrText>
           </w:r>
           <w:r>
             <w:rPr>
@@ -902,41 +902,19 @@
           </w:r>
           <w:r>
             <w:rPr>
-              <w:rFonts w:hint="eastAsia" w:ascii="楷体" w:hAnsi="楷体" w:eastAsia="楷体" w:cs="楷体"/>
-              <w:bCs/>
-              <w:kern w:val="0"/>
-              <w:szCs w:val="32"/>
-              <w:lang w:val="en-US" w:eastAsia="zh-CN" w:bidi="ar"/>
-            </w:rPr>
-            <w:t>2</w:t>
-          </w:r>
-          <w:r>
-            <w:rPr>
-              <w:rFonts w:hint="default" w:ascii="楷体" w:hAnsi="楷体" w:eastAsia="楷体" w:cs="楷体"/>
-              <w:bCs/>
-              <w:kern w:val="0"/>
-              <w:szCs w:val="32"/>
-              <w:lang w:val="en-US" w:eastAsia="zh-CN" w:bidi="ar"/>
-            </w:rPr>
-            <w:t>.</w:t>
-          </w:r>
-          <w:r>
-            <w:rPr>
-              <w:rFonts w:hint="eastAsia" w:ascii="楷体" w:hAnsi="楷体" w:eastAsia="楷体" w:cs="楷体"/>
-              <w:bCs/>
-              <w:kern w:val="0"/>
-              <w:szCs w:val="32"/>
-              <w:lang w:val="en-US" w:eastAsia="zh-CN" w:bidi="ar"/>
-            </w:rPr>
-            <w:t xml:space="preserve">3 </w:t>
-          </w:r>
-          <w:r>
-            <w:rPr>
-              <w:rFonts w:hint="eastAsia" w:ascii="楷体" w:hAnsi="楷体" w:eastAsia="楷体" w:cs="楷体"/>
+              <w:rFonts w:hint="default" w:ascii="宋体" w:hAnsi="宋体" w:eastAsia="宋体" w:cs="宋体"/>
               <w:szCs w:val="32"/>
               <w:lang w:val="en-US" w:eastAsia="zh-CN"/>
             </w:rPr>
-            <w:t>Image Preview Area Overview</w:t>
+            <w:t xml:space="preserve">2.2.3.1.1 </w:t>
+          </w:r>
+          <w:r>
+            <w:rPr>
+              <w:rFonts w:hint="eastAsia" w:ascii="宋体" w:hAnsi="宋体" w:eastAsia="宋体" w:cs="宋体"/>
+              <w:szCs w:val="32"/>
+              <w:lang w:val="en-US" w:eastAsia="zh-CN"/>
+            </w:rPr>
+            <w:t>Recording &amp; Saving Interface</w:t>
           </w:r>
           <w:r>
             <w:tab/>
@@ -945,7 +923,7 @@
             <w:fldChar w:fldCharType="begin"/>
           </w:r>
           <w:r>
-            <w:instrText xml:space="preserve"> PAGEREF _Toc2657 \h </w:instrText>
+            <w:instrText xml:space="preserve"> PAGEREF _Toc5775 \h </w:instrText>
           </w:r>
           <w:r>
             <w:fldChar w:fldCharType="separate"/>
@@ -980,7 +958,7 @@
             <w:rPr>
               <w:rFonts w:hint="eastAsia" w:ascii="宋体" w:hAnsi="宋体" w:eastAsia="宋体" w:cs="宋体"/>
             </w:rPr>
-            <w:instrText xml:space="preserve"> HYPERLINK \l _Toc7154 </w:instrText>
+            <w:instrText xml:space="preserve"> HYPERLINK \l _Toc30710 </w:instrText>
           </w:r>
           <w:r>
             <w:rPr>
@@ -990,41 +968,11 @@
           </w:r>
           <w:r>
             <w:rPr>
-              <w:rFonts w:hint="eastAsia" w:ascii="楷体" w:hAnsi="楷体" w:eastAsia="楷体" w:cs="楷体"/>
-              <w:bCs/>
-              <w:kern w:val="0"/>
-              <w:szCs w:val="32"/>
-              <w:lang w:val="en-US" w:eastAsia="zh-CN" w:bidi="ar"/>
-            </w:rPr>
-            <w:t>2</w:t>
-          </w:r>
-          <w:r>
-            <w:rPr>
-              <w:rFonts w:hint="default" w:ascii="楷体" w:hAnsi="楷体" w:eastAsia="楷体" w:cs="楷体"/>
-              <w:bCs/>
-              <w:kern w:val="0"/>
-              <w:szCs w:val="32"/>
-              <w:lang w:val="en-US" w:eastAsia="zh-CN" w:bidi="ar"/>
-            </w:rPr>
-            <w:t>.</w:t>
-          </w:r>
-          <w:r>
-            <w:rPr>
-              <w:rFonts w:hint="eastAsia" w:ascii="楷体" w:hAnsi="楷体" w:eastAsia="楷体" w:cs="楷体"/>
-              <w:bCs/>
-              <w:kern w:val="0"/>
-              <w:szCs w:val="32"/>
-              <w:lang w:val="en-US" w:eastAsia="zh-CN" w:bidi="ar"/>
-            </w:rPr>
-            <w:t xml:space="preserve">4 </w:t>
-          </w:r>
-          <w:r>
-            <w:rPr>
-              <w:rFonts w:hint="eastAsia" w:ascii="楷体" w:hAnsi="楷体" w:eastAsia="楷体" w:cs="楷体"/>
+              <w:rFonts w:hint="default" w:ascii="宋体" w:hAnsi="宋体" w:eastAsia="宋体" w:cs="宋体"/>
               <w:szCs w:val="32"/>
               <w:lang w:val="en-US" w:eastAsia="zh-CN"/>
             </w:rPr>
-            <w:t>Sensor Info Preview Area</w:t>
+            <w:t>2.2.3.1.2 Performance interface</w:t>
           </w:r>
           <w:r>
             <w:tab/>
@@ -1033,13 +981,13 @@
             <w:fldChar w:fldCharType="begin"/>
           </w:r>
           <w:r>
-            <w:instrText xml:space="preserve"> PAGEREF _Toc7154 \h </w:instrText>
+            <w:instrText xml:space="preserve"> PAGEREF _Toc30710 \h </w:instrText>
           </w:r>
           <w:r>
             <w:fldChar w:fldCharType="separate"/>
           </w:r>
           <w:r>
-            <w:t>8</w:t>
+            <w:t>7</w:t>
           </w:r>
           <w:r>
             <w:fldChar w:fldCharType="end"/>
@@ -1068,7 +1016,7 @@
             <w:rPr>
               <w:rFonts w:hint="eastAsia" w:ascii="宋体" w:hAnsi="宋体" w:eastAsia="宋体" w:cs="宋体"/>
             </w:rPr>
-            <w:instrText xml:space="preserve"> HYPERLINK \l _Toc24384 </w:instrText>
+            <w:instrText xml:space="preserve"> HYPERLINK \l _Toc25790 </w:instrText>
           </w:r>
           <w:r>
             <w:rPr>
@@ -1104,7 +1052,7 @@
               <w:szCs w:val="32"/>
               <w:lang w:val="en-US" w:eastAsia="zh-CN" w:bidi="ar"/>
             </w:rPr>
-            <w:t xml:space="preserve">5 </w:t>
+            <w:t xml:space="preserve">3 </w:t>
           </w:r>
           <w:r>
             <w:rPr>
@@ -1112,7 +1060,7 @@
               <w:szCs w:val="32"/>
               <w:lang w:val="en-US" w:eastAsia="zh-CN"/>
             </w:rPr>
-            <w:t>VIO Test Preview Area</w:t>
+            <w:t>Image Preview Area Overview</w:t>
           </w:r>
           <w:r>
             <w:tab/>
@@ -1121,7 +1069,7 @@
             <w:fldChar w:fldCharType="begin"/>
           </w:r>
           <w:r>
-            <w:instrText xml:space="preserve"> PAGEREF _Toc24384 \h </w:instrText>
+            <w:instrText xml:space="preserve"> PAGEREF _Toc25790 \h </w:instrText>
           </w:r>
           <w:r>
             <w:fldChar w:fldCharType="separate"/>
@@ -1156,7 +1104,7 @@
             <w:rPr>
               <w:rFonts w:hint="eastAsia" w:ascii="宋体" w:hAnsi="宋体" w:eastAsia="宋体" w:cs="宋体"/>
             </w:rPr>
-            <w:instrText xml:space="preserve"> HYPERLINK \l _Toc16964 </w:instrText>
+            <w:instrText xml:space="preserve"> HYPERLINK \l _Toc21408 </w:instrText>
           </w:r>
           <w:r>
             <w:rPr>
@@ -1192,15 +1140,15 @@
               <w:szCs w:val="32"/>
               <w:lang w:val="en-US" w:eastAsia="zh-CN" w:bidi="ar"/>
             </w:rPr>
-            <w:t xml:space="preserve">6 </w:t>
+            <w:t xml:space="preserve">4 </w:t>
           </w:r>
           <w:r>
             <w:rPr>
               <w:rFonts w:hint="eastAsia" w:ascii="楷体" w:hAnsi="楷体" w:eastAsia="楷体" w:cs="楷体"/>
-              <w:kern w:val="2"/>
               <w:szCs w:val="32"/>
-            </w:rPr>
-            <w:t>Control Panel Overview</w:t>
+              <w:lang w:val="en-US" w:eastAsia="zh-CN"/>
+            </w:rPr>
+            <w:t>Sensor Info Preview Area</w:t>
           </w:r>
           <w:r>
             <w:tab/>
@@ -1209,7 +1157,7 @@
             <w:fldChar w:fldCharType="begin"/>
           </w:r>
           <w:r>
-            <w:instrText xml:space="preserve"> PAGEREF _Toc16964 \h </w:instrText>
+            <w:instrText xml:space="preserve"> PAGEREF _Toc21408 \h </w:instrText>
           </w:r>
           <w:r>
             <w:fldChar w:fldCharType="separate"/>
@@ -1244,7 +1192,7 @@
             <w:rPr>
               <w:rFonts w:hint="eastAsia" w:ascii="宋体" w:hAnsi="宋体" w:eastAsia="宋体" w:cs="宋体"/>
             </w:rPr>
-            <w:instrText xml:space="preserve"> HYPERLINK \l _Toc5022 </w:instrText>
+            <w:instrText xml:space="preserve"> HYPERLINK \l _Toc28345 </w:instrText>
           </w:r>
           <w:r>
             <w:rPr>
@@ -1280,7 +1228,7 @@
               <w:szCs w:val="32"/>
               <w:lang w:val="en-US" w:eastAsia="zh-CN" w:bidi="ar"/>
             </w:rPr>
-            <w:t xml:space="preserve">7 </w:t>
+            <w:t xml:space="preserve">5 </w:t>
           </w:r>
           <w:r>
             <w:rPr>
@@ -1288,6 +1236,182 @@
               <w:szCs w:val="32"/>
               <w:lang w:val="en-US" w:eastAsia="zh-CN"/>
             </w:rPr>
+            <w:t>VIO Test Preview Area</w:t>
+          </w:r>
+          <w:r>
+            <w:tab/>
+          </w:r>
+          <w:r>
+            <w:fldChar w:fldCharType="begin"/>
+          </w:r>
+          <w:r>
+            <w:instrText xml:space="preserve"> PAGEREF _Toc28345 \h </w:instrText>
+          </w:r>
+          <w:r>
+            <w:fldChar w:fldCharType="separate"/>
+          </w:r>
+          <w:r>
+            <w:t>9</w:t>
+          </w:r>
+          <w:r>
+            <w:fldChar w:fldCharType="end"/>
+          </w:r>
+          <w:r>
+            <w:rPr>
+              <w:rFonts w:hint="eastAsia" w:ascii="宋体" w:hAnsi="宋体" w:eastAsia="宋体" w:cs="宋体"/>
+            </w:rPr>
+            <w:fldChar w:fldCharType="end"/>
+          </w:r>
+        </w:p>
+        <w:p>
+          <w:pPr>
+            <w:pStyle w:val="7"/>
+            <w:tabs>
+              <w:tab w:val="right" w:leader="dot" w:pos="8306"/>
+            </w:tabs>
+          </w:pPr>
+          <w:r>
+            <w:rPr>
+              <w:rFonts w:hint="eastAsia" w:ascii="宋体" w:hAnsi="宋体" w:eastAsia="宋体" w:cs="宋体"/>
+            </w:rPr>
+            <w:fldChar w:fldCharType="begin"/>
+          </w:r>
+          <w:r>
+            <w:rPr>
+              <w:rFonts w:hint="eastAsia" w:ascii="宋体" w:hAnsi="宋体" w:eastAsia="宋体" w:cs="宋体"/>
+            </w:rPr>
+            <w:instrText xml:space="preserve"> HYPERLINK \l _Toc4064 </w:instrText>
+          </w:r>
+          <w:r>
+            <w:rPr>
+              <w:rFonts w:hint="eastAsia" w:ascii="宋体" w:hAnsi="宋体" w:eastAsia="宋体" w:cs="宋体"/>
+            </w:rPr>
+            <w:fldChar w:fldCharType="separate"/>
+          </w:r>
+          <w:r>
+            <w:rPr>
+              <w:rFonts w:hint="eastAsia" w:ascii="楷体" w:hAnsi="楷体" w:eastAsia="楷体" w:cs="楷体"/>
+              <w:bCs/>
+              <w:kern w:val="0"/>
+              <w:szCs w:val="32"/>
+              <w:lang w:val="en-US" w:eastAsia="zh-CN" w:bidi="ar"/>
+            </w:rPr>
+            <w:t>2</w:t>
+          </w:r>
+          <w:r>
+            <w:rPr>
+              <w:rFonts w:hint="default" w:ascii="楷体" w:hAnsi="楷体" w:eastAsia="楷体" w:cs="楷体"/>
+              <w:bCs/>
+              <w:kern w:val="0"/>
+              <w:szCs w:val="32"/>
+              <w:lang w:val="en-US" w:eastAsia="zh-CN" w:bidi="ar"/>
+            </w:rPr>
+            <w:t>.</w:t>
+          </w:r>
+          <w:r>
+            <w:rPr>
+              <w:rFonts w:hint="eastAsia" w:ascii="楷体" w:hAnsi="楷体" w:eastAsia="楷体" w:cs="楷体"/>
+              <w:bCs/>
+              <w:kern w:val="0"/>
+              <w:szCs w:val="32"/>
+              <w:lang w:val="en-US" w:eastAsia="zh-CN" w:bidi="ar"/>
+            </w:rPr>
+            <w:t xml:space="preserve">6 </w:t>
+          </w:r>
+          <w:r>
+            <w:rPr>
+              <w:rFonts w:hint="eastAsia" w:ascii="楷体" w:hAnsi="楷体" w:eastAsia="楷体" w:cs="楷体"/>
+              <w:kern w:val="2"/>
+              <w:szCs w:val="32"/>
+            </w:rPr>
+            <w:t>Control Panel Overview</w:t>
+          </w:r>
+          <w:r>
+            <w:tab/>
+          </w:r>
+          <w:r>
+            <w:fldChar w:fldCharType="begin"/>
+          </w:r>
+          <w:r>
+            <w:instrText xml:space="preserve"> PAGEREF _Toc4064 \h </w:instrText>
+          </w:r>
+          <w:r>
+            <w:fldChar w:fldCharType="separate"/>
+          </w:r>
+          <w:r>
+            <w:t>10</w:t>
+          </w:r>
+          <w:r>
+            <w:fldChar w:fldCharType="end"/>
+          </w:r>
+          <w:r>
+            <w:rPr>
+              <w:rFonts w:hint="eastAsia" w:ascii="宋体" w:hAnsi="宋体" w:eastAsia="宋体" w:cs="宋体"/>
+            </w:rPr>
+            <w:fldChar w:fldCharType="end"/>
+          </w:r>
+        </w:p>
+        <w:p>
+          <w:pPr>
+            <w:pStyle w:val="7"/>
+            <w:tabs>
+              <w:tab w:val="right" w:leader="dot" w:pos="8306"/>
+            </w:tabs>
+          </w:pPr>
+          <w:r>
+            <w:rPr>
+              <w:rFonts w:hint="eastAsia" w:ascii="宋体" w:hAnsi="宋体" w:eastAsia="宋体" w:cs="宋体"/>
+            </w:rPr>
+            <w:fldChar w:fldCharType="begin"/>
+          </w:r>
+          <w:r>
+            <w:rPr>
+              <w:rFonts w:hint="eastAsia" w:ascii="宋体" w:hAnsi="宋体" w:eastAsia="宋体" w:cs="宋体"/>
+            </w:rPr>
+            <w:instrText xml:space="preserve"> HYPERLINK \l _Toc6144 </w:instrText>
+          </w:r>
+          <w:r>
+            <w:rPr>
+              <w:rFonts w:hint="eastAsia" w:ascii="宋体" w:hAnsi="宋体" w:eastAsia="宋体" w:cs="宋体"/>
+            </w:rPr>
+            <w:fldChar w:fldCharType="separate"/>
+          </w:r>
+          <w:r>
+            <w:rPr>
+              <w:rFonts w:hint="eastAsia" w:ascii="楷体" w:hAnsi="楷体" w:eastAsia="楷体" w:cs="楷体"/>
+              <w:bCs/>
+              <w:kern w:val="0"/>
+              <w:szCs w:val="32"/>
+              <w:lang w:val="en-US" w:eastAsia="zh-CN" w:bidi="ar"/>
+            </w:rPr>
+            <w:t>2</w:t>
+          </w:r>
+          <w:r>
+            <w:rPr>
+              <w:rFonts w:hint="default" w:ascii="楷体" w:hAnsi="楷体" w:eastAsia="楷体" w:cs="楷体"/>
+              <w:bCs/>
+              <w:kern w:val="0"/>
+              <w:szCs w:val="32"/>
+              <w:lang w:val="en-US" w:eastAsia="zh-CN" w:bidi="ar"/>
+            </w:rPr>
+            <w:t>.</w:t>
+          </w:r>
+          <w:r>
+            <w:rPr>
+              <w:rFonts w:hint="eastAsia" w:ascii="楷体" w:hAnsi="楷体" w:eastAsia="楷体" w:cs="楷体"/>
+              <w:bCs/>
+              <w:kern w:val="0"/>
+              <w:szCs w:val="32"/>
+              <w:lang w:val="en-US" w:eastAsia="zh-CN" w:bidi="ar"/>
+            </w:rPr>
+            <w:t xml:space="preserve">7 </w:t>
+          </w:r>
+          <w:r>
+            <w:rPr>
+              <w:rFonts w:hint="eastAsia" w:ascii="楷体" w:hAnsi="楷体" w:eastAsia="楷体" w:cs="楷体"/>
+              <w:szCs w:val="32"/>
+              <w:lang w:val="en-US" w:eastAsia="zh-CN"/>
+            </w:rPr>
             <w:t>IMU Data Line Chart</w:t>
           </w:r>
           <w:r>
@@ -1297,13 +1421,13 @@
             <w:fldChar w:fldCharType="begin"/>
           </w:r>
           <w:r>
-            <w:instrText xml:space="preserve"> PAGEREF _Toc5022 \h </w:instrText>
+            <w:instrText xml:space="preserve"> PAGEREF _Toc6144 \h </w:instrText>
           </w:r>
           <w:r>
             <w:fldChar w:fldCharType="separate"/>
           </w:r>
           <w:r>
-            <w:t>10</w:t>
+            <w:t>11</w:t>
           </w:r>
           <w:r>
             <w:fldChar w:fldCharType="end"/>
@@ -1332,7 +1456,7 @@
             <w:rPr>
               <w:rFonts w:hint="eastAsia" w:ascii="宋体" w:hAnsi="宋体" w:eastAsia="宋体" w:cs="宋体"/>
             </w:rPr>
-            <w:instrText xml:space="preserve"> HYPERLINK \l _Toc27857 </w:instrText>
+            <w:instrText xml:space="preserve"> HYPERLINK \l _Toc13333 </w:instrText>
           </w:r>
           <w:r>
             <w:rPr>
@@ -1365,13 +1489,13 @@
             <w:fldChar w:fldCharType="begin"/>
           </w:r>
           <w:r>
-            <w:instrText xml:space="preserve"> PAGEREF _Toc27857 \h </w:instrText>
+            <w:instrText xml:space="preserve"> PAGEREF _Toc13333 \h </w:instrText>
           </w:r>
           <w:r>
             <w:fldChar w:fldCharType="separate"/>
           </w:r>
           <w:r>
-            <w:t>11</w:t>
+            <w:t>12</w:t>
           </w:r>
           <w:r>
             <w:fldChar w:fldCharType="end"/>
@@ -1400,7 +1524,7 @@
             <w:rPr>
               <w:rFonts w:hint="eastAsia" w:ascii="宋体" w:hAnsi="宋体" w:eastAsia="宋体" w:cs="宋体"/>
             </w:rPr>
-            <w:instrText xml:space="preserve"> HYPERLINK \l _Toc1056 </w:instrText>
+            <w:instrText xml:space="preserve"> HYPERLINK \l _Toc7401 </w:instrText>
           </w:r>
           <w:r>
             <w:rPr>
@@ -1431,13 +1555,13 @@
             <w:fldChar w:fldCharType="begin"/>
           </w:r>
           <w:r>
-            <w:instrText xml:space="preserve"> PAGEREF _Toc1056 \h </w:instrText>
+            <w:instrText xml:space="preserve"> PAGEREF _Toc7401 \h </w:instrText>
           </w:r>
           <w:r>
             <w:fldChar w:fldCharType="separate"/>
           </w:r>
           <w:r>
-            <w:t>11</w:t>
+            <w:t>12</w:t>
           </w:r>
           <w:r>
             <w:fldChar w:fldCharType="end"/>
@@ -1466,7 +1590,7 @@
             <w:rPr>
               <w:rFonts w:hint="eastAsia" w:ascii="宋体" w:hAnsi="宋体" w:eastAsia="宋体" w:cs="宋体"/>
             </w:rPr>
-            <w:instrText xml:space="preserve"> HYPERLINK \l _Toc30061 </w:instrText>
+            <w:instrText xml:space="preserve"> HYPERLINK \l _Toc23520 </w:instrText>
           </w:r>
           <w:r>
             <w:rPr>
@@ -1497,13 +1621,13 @@
             <w:fldChar w:fldCharType="begin"/>
           </w:r>
           <w:r>
-            <w:instrText xml:space="preserve"> PAGEREF _Toc30061 \h </w:instrText>
+            <w:instrText xml:space="preserve"> PAGEREF _Toc23520 \h </w:instrText>
           </w:r>
           <w:r>
             <w:fldChar w:fldCharType="separate"/>
           </w:r>
           <w:r>
-            <w:t>11</w:t>
+            <w:t>12</w:t>
           </w:r>
           <w:r>
             <w:fldChar w:fldCharType="end"/>
@@ -1532,7 +1656,7 @@
             <w:rPr>
               <w:rFonts w:hint="eastAsia" w:ascii="宋体" w:hAnsi="宋体" w:eastAsia="宋体" w:cs="宋体"/>
             </w:rPr>
-            <w:instrText xml:space="preserve"> HYPERLINK \l _Toc23559 </w:instrText>
+            <w:instrText xml:space="preserve"> HYPERLINK \l _Toc24723 </w:instrText>
           </w:r>
           <w:r>
             <w:rPr>
@@ -1563,13 +1687,13 @@
             <w:fldChar w:fldCharType="begin"/>
           </w:r>
           <w:r>
-            <w:instrText xml:space="preserve"> PAGEREF _Toc23559 \h </w:instrText>
+            <w:instrText xml:space="preserve"> PAGEREF _Toc24723 \h </w:instrText>
           </w:r>
           <w:r>
             <w:fldChar w:fldCharType="separate"/>
           </w:r>
           <w:r>
-            <w:t>11</w:t>
+            <w:t>12</w:t>
           </w:r>
           <w:r>
             <w:fldChar w:fldCharType="end"/>
@@ -1598,7 +1722,7 @@
             <w:rPr>
               <w:rFonts w:hint="eastAsia" w:ascii="宋体" w:hAnsi="宋体" w:eastAsia="宋体" w:cs="宋体"/>
             </w:rPr>
-            <w:instrText xml:space="preserve"> HYPERLINK \l _Toc6182 </w:instrText>
+            <w:instrText xml:space="preserve"> HYPERLINK \l _Toc17380 </w:instrText>
           </w:r>
           <w:r>
             <w:rPr>
@@ -1629,13 +1753,13 @@
             <w:fldChar w:fldCharType="begin"/>
           </w:r>
           <w:r>
-            <w:instrText xml:space="preserve"> PAGEREF _Toc6182 \h </w:instrText>
+            <w:instrText xml:space="preserve"> PAGEREF _Toc17380 \h </w:instrText>
           </w:r>
           <w:r>
             <w:fldChar w:fldCharType="separate"/>
           </w:r>
           <w:r>
-            <w:t>11</w:t>
+            <w:t>12</w:t>
           </w:r>
           <w:r>
             <w:fldChar w:fldCharType="end"/>
@@ -1710,7 +1834,7 @@
           <w:rFonts w:hint="eastAsia" w:ascii="黑体" w:hAnsi="黑体" w:eastAsia="黑体" w:cs="黑体"/>
         </w:rPr>
       </w:pPr>
-      <w:bookmarkStart w:id="0" w:name="_Toc26413"/>
+      <w:bookmarkStart w:id="0" w:name="_Toc24160"/>
       <w:r>
         <w:rPr>
           <w:rFonts w:hint="eastAsia" w:ascii="黑体" w:hAnsi="黑体" w:eastAsia="黑体" w:cs="黑体"/>
@@ -1735,7 +1859,7 @@
           <w:szCs w:val="32"/>
         </w:rPr>
       </w:pPr>
-      <w:bookmarkStart w:id="1" w:name="_Toc28917"/>
+      <w:bookmarkStart w:id="1" w:name="_Toc15297"/>
       <w:r>
         <w:rPr>
           <w:rStyle w:val="19"/>
@@ -1801,7 +1925,7 @@
           <w:lang w:val="en-US" w:eastAsia="zh-CN"/>
         </w:rPr>
       </w:pPr>
-      <w:bookmarkStart w:id="2" w:name="_Toc29235"/>
+      <w:bookmarkStart w:id="2" w:name="_Toc1558"/>
       <w:r>
         <w:rPr>
           <w:rStyle w:val="19"/>
@@ -1879,7 +2003,7 @@
           <w:lang w:val="en-US" w:eastAsia="zh-CN"/>
         </w:rPr>
       </w:pPr>
-      <w:bookmarkStart w:id="3" w:name="_Toc5871"/>
+      <w:bookmarkStart w:id="3" w:name="_Toc11804"/>
       <w:r>
         <w:rPr>
           <w:rFonts w:hint="eastAsia" w:ascii="黑体" w:hAnsi="黑体" w:eastAsia="黑体" w:cs="黑体"/>
@@ -1911,7 +2035,7 @@
           <w:lang w:val="en-US" w:eastAsia="zh-CN"/>
         </w:rPr>
       </w:pPr>
-      <w:bookmarkStart w:id="4" w:name="_Toc25288"/>
+      <w:bookmarkStart w:id="4" w:name="_Toc21931"/>
       <w:r>
         <w:rPr>
           <w:rFonts w:hint="eastAsia" w:ascii="楷体" w:hAnsi="楷体" w:eastAsia="楷体" w:cs="楷体"/>
@@ -2205,12 +2329,6 @@
             <w:insideH w:val="single" w:color="auto" w:sz="4" w:space="0"/>
             <w:insideV w:val="single" w:color="auto" w:sz="4" w:space="0"/>
           </w:tblBorders>
-          <w:tblCellMar>
-            <w:top w:w="0" w:type="dxa"/>
-            <w:left w:w="108" w:type="dxa"/>
-            <w:bottom w:w="0" w:type="dxa"/>
-            <w:right w:w="108" w:type="dxa"/>
-          </w:tblCellMar>
         </w:tblPrEx>
         <w:tc>
           <w:tcPr>
@@ -2852,7 +2970,7 @@
           <w:lang w:val="en-US" w:eastAsia="zh-CN"/>
         </w:rPr>
       </w:pPr>
-      <w:bookmarkStart w:id="5" w:name="_Toc30402"/>
+      <w:bookmarkStart w:id="5" w:name="_Toc8718"/>
       <w:r>
         <w:rPr>
           <w:rFonts w:hint="eastAsia" w:ascii="楷体" w:hAnsi="楷体" w:eastAsia="楷体" w:cs="楷体"/>
@@ -2990,7 +3108,7 @@
           <w:lang w:val="en-US" w:eastAsia="zh-CN"/>
         </w:rPr>
       </w:pPr>
-      <w:bookmarkStart w:id="6" w:name="_Toc9009"/>
+      <w:bookmarkStart w:id="6" w:name="_Toc19937"/>
       <w:r>
         <w:rPr>
           <w:rFonts w:hint="eastAsia" w:ascii="宋体" w:hAnsi="宋体" w:eastAsia="宋体" w:cs="宋体"/>
@@ -3126,7 +3244,7 @@
           <w:lang w:val="en-US" w:eastAsia="zh-CN"/>
         </w:rPr>
       </w:pPr>
-      <w:bookmarkStart w:id="7" w:name="_Toc14339"/>
+      <w:bookmarkStart w:id="7" w:name="_Toc18655"/>
       <w:r>
         <w:rPr>
           <w:rFonts w:hint="eastAsia" w:ascii="宋体" w:hAnsi="宋体" w:eastAsia="宋体" w:cs="宋体"/>
@@ -3252,7 +3370,7 @@
           <w:lang w:val="en-US" w:eastAsia="zh-CN"/>
         </w:rPr>
       </w:pPr>
-      <w:bookmarkStart w:id="8" w:name="_Toc29088"/>
+      <w:bookmarkStart w:id="8" w:name="_Toc2095"/>
       <w:r>
         <w:rPr>
           <w:rFonts w:hint="eastAsia" w:ascii="宋体" w:hAnsi="宋体" w:eastAsia="宋体" w:cs="宋体"/>
@@ -3376,7 +3494,7 @@
           <w:lang w:val="en-US" w:eastAsia="zh-CN"/>
         </w:rPr>
       </w:pPr>
-      <w:bookmarkStart w:id="9" w:name="_Toc18751"/>
+      <w:bookmarkStart w:id="9" w:name="_Toc30288"/>
       <w:r>
         <w:rPr>
           <w:rFonts w:hint="eastAsia" w:ascii="宋体" w:hAnsi="宋体" w:eastAsia="宋体" w:cs="宋体"/>
@@ -3509,7 +3627,7 @@
           <w:lang w:val="en-US" w:eastAsia="zh-CN"/>
         </w:rPr>
       </w:pPr>
-      <w:bookmarkStart w:id="10" w:name="_Toc12016"/>
+      <w:bookmarkStart w:id="10" w:name="_Toc12523"/>
       <w:r>
         <w:rPr>
           <w:rFonts w:hint="eastAsia" w:ascii="宋体" w:hAnsi="宋体" w:eastAsia="宋体" w:cs="宋体"/>
@@ -3523,48 +3641,47 @@
     </w:p>
     <w:p>
       <w:pPr>
-        <w:numPr>
-          <w:ilvl w:val="0"/>
-          <w:numId w:val="0"/>
-        </w:numPr>
+        <w:keepNext w:val="0"/>
+        <w:keepLines w:val="0"/>
+        <w:widowControl/>
+        <w:suppressLineNumbers w:val="0"/>
         <w:ind w:firstLine="420" w:firstLineChars="0"/>
-        <w:jc w:val="both"/>
-        <w:rPr>
-          <w:rFonts w:hint="eastAsia" w:ascii="宋体" w:hAnsi="宋体" w:eastAsia="宋体" w:cs="宋体"/>
-          <w:sz w:val="24"/>
-          <w:szCs w:val="24"/>
-          <w:lang w:val="en-US" w:eastAsia="zh-CN"/>
-        </w:rPr>
-      </w:pPr>
-      <w:r>
-        <w:rPr>
-          <w:rFonts w:hint="eastAsia" w:ascii="宋体" w:hAnsi="宋体" w:eastAsia="宋体" w:cs="宋体"/>
-          <w:sz w:val="24"/>
-          <w:szCs w:val="24"/>
-          <w:lang w:val="en-US" w:eastAsia="zh-CN"/>
-        </w:rPr>
-        <w:t>The Viewer settings can be configured. Currently, the function of saving test logs is available. The real-time received data will be saved locally once per second.</w:t>
-      </w:r>
-    </w:p>
-    <w:p>
-      <w:pPr>
-        <w:ind w:leftChars="100"/>
-        <w:jc w:val="both"/>
-        <w:rPr>
-          <w:rFonts w:hint="eastAsia" w:ascii="宋体" w:hAnsi="宋体" w:eastAsia="宋体" w:cs="宋体"/>
-          <w:lang w:val="en-US" w:eastAsia="zh-CN"/>
-        </w:rPr>
-      </w:pPr>
-      <w:r>
-        <w:rPr>
-          <w:rFonts w:hint="eastAsia" w:ascii="宋体" w:hAnsi="宋体" w:eastAsia="宋体" w:cs="宋体"/>
-          <w:lang w:val="en-US" w:eastAsia="zh-CN"/>
+        <w:jc w:val="left"/>
+        <w:rPr>
+          <w:rFonts w:hint="eastAsia" w:ascii="宋体" w:hAnsi="宋体" w:eastAsia="宋体" w:cs="宋体"/>
+          <w:lang w:val="en-US" w:eastAsia="zh-CN"/>
+        </w:rPr>
+      </w:pPr>
+      <w:r>
+        <w:rPr>
+          <w:rFonts w:hint="eastAsia" w:ascii="宋体" w:hAnsi="宋体" w:eastAsia="宋体" w:cs="宋体"/>
+          <w:sz w:val="24"/>
+          <w:szCs w:val="24"/>
+          <w:lang w:val="en-US" w:eastAsia="zh-CN"/>
+        </w:rPr>
+        <w:t>The Viewer settings can be configured, including settings for Recording &amp; Saving and Performance.</w:t>
+      </w:r>
+      <w:r>
+        <w:rPr>
+          <w:rFonts w:ascii="宋体" w:hAnsi="宋体" w:eastAsia="宋体" w:cs="宋体"/>
+          <w:kern w:val="0"/>
+          <w:sz w:val="24"/>
+          <w:szCs w:val="24"/>
+          <w:lang w:val="en-US" w:eastAsia="zh-CN" w:bidi="ar"/>
         </w:rPr>
         <w:drawing>
-          <wp:inline distT="0" distB="0" distL="114300" distR="114300">
-            <wp:extent cx="5266690" cy="2783205"/>
-            <wp:effectExtent l="0" t="0" r="6350" b="5715"/>
-            <wp:docPr id="12" name="图片 12" descr="{0013C4BD-56E5-46B1-96E2-53B793A138E6}"/>
+          <wp:anchor distT="0" distB="0" distL="114300" distR="114300" simplePos="0" relativeHeight="251667456" behindDoc="0" locked="0" layoutInCell="1" allowOverlap="1">
+            <wp:simplePos x="0" y="0"/>
+            <wp:positionH relativeFrom="column">
+              <wp:posOffset>0</wp:posOffset>
+            </wp:positionH>
+            <wp:positionV relativeFrom="paragraph">
+              <wp:posOffset>483870</wp:posOffset>
+            </wp:positionV>
+            <wp:extent cx="5266690" cy="2794000"/>
+            <wp:effectExtent l="0" t="0" r="6350" b="2540"/>
+            <wp:wrapTopAndBottom/>
+            <wp:docPr id="4" name="图片 1" descr="IMG_256"/>
             <wp:cNvGraphicFramePr>
               <a:graphicFrameLocks xmlns:a="http://schemas.openxmlformats.org/drawingml/2006/main" noChangeAspect="1"/>
             </wp:cNvGraphicFramePr>
@@ -3572,7 +3689,7 @@
               <a:graphicData uri="http://schemas.openxmlformats.org/drawingml/2006/picture">
                 <pic:pic xmlns:pic="http://schemas.openxmlformats.org/drawingml/2006/picture">
                   <pic:nvPicPr>
-                    <pic:cNvPr id="12" name="图片 12" descr="{0013C4BD-56E5-46B1-96E2-53B793A138E6}"/>
+                    <pic:cNvPr id="4" name="图片 1" descr="IMG_256"/>
                     <pic:cNvPicPr>
                       <a:picLocks noChangeAspect="1"/>
                     </pic:cNvPicPr>
@@ -3586,11 +3703,280 @@
                   <pic:spPr>
                     <a:xfrm>
                       <a:off x="0" y="0"/>
-                      <a:ext cx="5266690" cy="2783205"/>
+                      <a:ext cx="5266690" cy="2794000"/>
                     </a:xfrm>
                     <a:prstGeom prst="rect">
                       <a:avLst/>
                     </a:prstGeom>
+                    <a:noFill/>
+                    <a:ln w="9525">
+                      <a:noFill/>
+                    </a:ln>
+                  </pic:spPr>
+                </pic:pic>
+              </a:graphicData>
+            </a:graphic>
+          </wp:anchor>
+        </w:drawing>
+      </w:r>
+    </w:p>
+    <w:p>
+      <w:pPr>
+        <w:ind w:leftChars="100"/>
+        <w:jc w:val="center"/>
+        <w:rPr>
+          <w:rFonts w:hint="eastAsia" w:ascii="宋体" w:hAnsi="宋体" w:eastAsia="宋体" w:cs="宋体"/>
+          <w:lang w:val="en-US" w:eastAsia="zh-CN"/>
+        </w:rPr>
+      </w:pPr>
+      <w:r>
+        <w:rPr>
+          <w:rFonts w:hint="eastAsia" w:ascii="宋体" w:hAnsi="宋体" w:eastAsia="宋体" w:cs="宋体"/>
+          <w:lang w:val="en-US" w:eastAsia="zh-CN"/>
+        </w:rPr>
+        <w:t>Figure 2-7 Viewer settings interface</w:t>
+      </w:r>
+      <w:bookmarkStart w:id="11" w:name="_Toc29812"/>
+    </w:p>
+    <w:p>
+      <w:pPr>
+        <w:ind w:leftChars="100"/>
+        <w:jc w:val="center"/>
+        <w:rPr>
+          <w:rFonts w:hint="eastAsia" w:ascii="宋体" w:hAnsi="宋体" w:eastAsia="宋体" w:cs="宋体"/>
+          <w:lang w:val="en-US" w:eastAsia="zh-CN"/>
+        </w:rPr>
+      </w:pPr>
+    </w:p>
+    <w:p>
+      <w:pPr>
+        <w:pStyle w:val="4"/>
+        <w:numPr>
+          <w:ilvl w:val="4"/>
+          <w:numId w:val="1"/>
+        </w:numPr>
+        <w:bidi w:val="0"/>
+        <w:spacing w:line="240" w:lineRule="auto"/>
+        <w:ind w:left="0" w:leftChars="0" w:firstLine="0" w:firstLineChars="0"/>
+        <w:outlineLvl w:val="3"/>
+        <w:rPr>
+          <w:rFonts w:hint="default" w:ascii="宋体" w:hAnsi="宋体" w:eastAsia="宋体" w:cs="宋体"/>
+          <w:sz w:val="32"/>
+          <w:szCs w:val="32"/>
+          <w:lang w:val="en-US" w:eastAsia="zh-CN"/>
+        </w:rPr>
+      </w:pPr>
+      <w:bookmarkStart w:id="12" w:name="_Toc5775"/>
+      <w:r>
+        <w:rPr>
+          <w:rFonts w:hint="eastAsia" w:ascii="宋体" w:hAnsi="宋体" w:eastAsia="宋体" w:cs="宋体"/>
+          <w:sz w:val="32"/>
+          <w:szCs w:val="32"/>
+          <w:lang w:val="en-US" w:eastAsia="zh-CN"/>
+        </w:rPr>
+        <w:t>Recording &amp; Saving Interface</w:t>
+      </w:r>
+      <w:bookmarkEnd w:id="12"/>
+    </w:p>
+    <w:p>
+      <w:pPr>
+        <w:ind w:firstLine="420" w:firstLineChars="0"/>
+        <w:rPr>
+          <w:rFonts w:hint="default" w:ascii="宋体" w:hAnsi="宋体" w:eastAsia="宋体" w:cs="宋体"/>
+          <w:sz w:val="24"/>
+          <w:szCs w:val="24"/>
+          <w:lang w:val="en-US" w:eastAsia="zh-CN"/>
+        </w:rPr>
+      </w:pPr>
+      <w:r>
+        <w:rPr>
+          <w:rFonts w:hint="default" w:ascii="宋体" w:hAnsi="宋体" w:eastAsia="宋体" w:cs="宋体"/>
+          <w:sz w:val="24"/>
+          <w:szCs w:val="24"/>
+          <w:lang w:val="en-US" w:eastAsia="zh-CN"/>
+        </w:rPr>
+        <w:t>This interface provides the function to save the received data and information streams from the camera.</w:t>
+      </w:r>
+    </w:p>
+    <w:p>
+      <w:pPr>
+        <w:numPr>
+          <w:numId w:val="0"/>
+        </w:numPr>
+        <w:ind w:leftChars="0" w:firstLine="420" w:firstLineChars="0"/>
+        <w:rPr>
+          <w:rFonts w:hint="default" w:ascii="宋体" w:hAnsi="宋体" w:eastAsia="宋体" w:cs="宋体"/>
+          <w:sz w:val="24"/>
+          <w:szCs w:val="24"/>
+          <w:lang w:val="en-US" w:eastAsia="zh-CN"/>
+        </w:rPr>
+      </w:pPr>
+      <w:r>
+        <w:rPr>
+          <w:rFonts w:hint="eastAsia" w:ascii="宋体" w:hAnsi="宋体" w:eastAsia="宋体" w:cs="宋体"/>
+          <w:sz w:val="24"/>
+          <w:szCs w:val="24"/>
+          <w:lang w:val="en-US" w:eastAsia="zh-CN"/>
+        </w:rPr>
+        <w:t xml:space="preserve">- </w:t>
+      </w:r>
+      <w:r>
+        <w:rPr>
+          <w:rFonts w:hint="default" w:ascii="宋体" w:hAnsi="宋体" w:eastAsia="宋体" w:cs="宋体"/>
+          <w:sz w:val="24"/>
+          <w:szCs w:val="24"/>
+          <w:lang w:val="en-US" w:eastAsia="zh-CN"/>
+        </w:rPr>
+        <w:t>Save Test Info Button: After clicking, a log file will be created in the current "./" path, and the button will change to the prompt: "Stop Saving Test Info". Then, the received data within the previous second and the last frame received data will be output and saved at a frequency of once per second until the next "Stop" click.</w:t>
+      </w:r>
+    </w:p>
+    <w:p>
+      <w:pPr>
+        <w:numPr>
+          <w:numId w:val="0"/>
+        </w:numPr>
+        <w:ind w:leftChars="0" w:firstLine="420" w:firstLineChars="0"/>
+        <w:rPr>
+          <w:rFonts w:hint="default" w:ascii="宋体" w:hAnsi="宋体" w:eastAsia="宋体" w:cs="宋体"/>
+          <w:sz w:val="24"/>
+          <w:szCs w:val="24"/>
+          <w:lang w:val="en-US" w:eastAsia="zh-CN"/>
+        </w:rPr>
+      </w:pPr>
+      <w:r>
+        <w:rPr>
+          <w:rFonts w:hint="eastAsia" w:ascii="宋体" w:hAnsi="宋体" w:eastAsia="宋体" w:cs="宋体"/>
+          <w:sz w:val="24"/>
+          <w:szCs w:val="24"/>
+          <w:lang w:val="en-US" w:eastAsia="zh-CN"/>
+        </w:rPr>
+        <w:t xml:space="preserve">- </w:t>
+      </w:r>
+      <w:r>
+        <w:rPr>
+          <w:rFonts w:hint="default" w:ascii="宋体" w:hAnsi="宋体" w:eastAsia="宋体" w:cs="宋体"/>
+          <w:sz w:val="24"/>
+          <w:szCs w:val="24"/>
+          <w:lang w:val="en-US" w:eastAsia="zh-CN"/>
+        </w:rPr>
+        <w:t>Save Depth Image Button: After clicking, the received depth image will be saved to the "./saved_images/depth_" folder as a PGM file, and the saving will be paused until the "Stop" click.</w:t>
+      </w:r>
+    </w:p>
+    <w:p>
+      <w:pPr>
+        <w:numPr>
+          <w:numId w:val="0"/>
+        </w:numPr>
+        <w:ind w:leftChars="0" w:firstLine="420" w:firstLineChars="0"/>
+        <w:rPr>
+          <w:rFonts w:hint="default" w:ascii="宋体" w:hAnsi="宋体" w:eastAsia="宋体" w:cs="宋体"/>
+          <w:sz w:val="24"/>
+          <w:szCs w:val="24"/>
+          <w:lang w:val="en-US" w:eastAsia="zh-CN"/>
+        </w:rPr>
+      </w:pPr>
+      <w:r>
+        <w:rPr>
+          <w:rFonts w:hint="eastAsia" w:ascii="宋体" w:hAnsi="宋体" w:eastAsia="宋体" w:cs="宋体"/>
+          <w:sz w:val="24"/>
+          <w:szCs w:val="24"/>
+          <w:lang w:val="en-US" w:eastAsia="zh-CN"/>
+        </w:rPr>
+        <w:t xml:space="preserve">- </w:t>
+      </w:r>
+      <w:r>
+        <w:rPr>
+          <w:rFonts w:hint="default" w:ascii="宋体" w:hAnsi="宋体" w:eastAsia="宋体" w:cs="宋体"/>
+          <w:sz w:val="24"/>
+          <w:szCs w:val="24"/>
+          <w:lang w:val="en-US" w:eastAsia="zh-CN"/>
+        </w:rPr>
+        <w:t>Save Gray Image Button: After clicking, the received depth image will be saved to the "./saved_images/gray_" folder as a PGM file, and the saving will be paused until the "Stop" click.</w:t>
+      </w:r>
+    </w:p>
+    <w:p>
+      <w:pPr>
+        <w:numPr>
+          <w:numId w:val="0"/>
+        </w:numPr>
+        <w:ind w:leftChars="0" w:firstLine="420" w:firstLineChars="0"/>
+        <w:rPr>
+          <w:rFonts w:hint="default" w:ascii="宋体" w:hAnsi="宋体" w:eastAsia="宋体" w:cs="宋体"/>
+          <w:sz w:val="24"/>
+          <w:szCs w:val="24"/>
+          <w:lang w:val="en-US" w:eastAsia="zh-CN"/>
+        </w:rPr>
+      </w:pPr>
+      <w:r>
+        <w:rPr>
+          <w:rFonts w:hint="eastAsia" w:ascii="宋体" w:hAnsi="宋体" w:eastAsia="宋体" w:cs="宋体"/>
+          <w:sz w:val="24"/>
+          <w:szCs w:val="24"/>
+          <w:lang w:val="en-US" w:eastAsia="zh-CN"/>
+        </w:rPr>
+        <w:t xml:space="preserve">- </w:t>
+      </w:r>
+      <w:r>
+        <w:rPr>
+          <w:rFonts w:hint="default" w:ascii="宋体" w:hAnsi="宋体" w:eastAsia="宋体" w:cs="宋体"/>
+          <w:sz w:val="24"/>
+          <w:szCs w:val="24"/>
+          <w:lang w:val="en-US" w:eastAsia="zh-CN"/>
+        </w:rPr>
+        <w:t>Save RGB Image Button: After clicking, the received depth image will be saved to the "./saved_images/rgb_" folder as a jpg file, and the saving will be paused until the "Stop" click.</w:t>
+      </w:r>
+    </w:p>
+    <w:p>
+      <w:pPr>
+        <w:keepNext w:val="0"/>
+        <w:keepLines w:val="0"/>
+        <w:widowControl/>
+        <w:suppressLineNumbers w:val="0"/>
+        <w:jc w:val="center"/>
+      </w:pPr>
+      <w:r>
+        <w:rPr>
+          <w:rFonts w:ascii="宋体" w:hAnsi="宋体" w:eastAsia="宋体" w:cs="宋体"/>
+          <w:kern w:val="0"/>
+          <w:sz w:val="24"/>
+          <w:szCs w:val="24"/>
+          <w:lang w:val="en-US" w:eastAsia="zh-CN" w:bidi="ar"/>
+        </w:rPr>
+        <w:drawing>
+          <wp:inline distT="0" distB="0" distL="114300" distR="114300">
+            <wp:extent cx="5266690" cy="2784475"/>
+            <wp:effectExtent l="0" t="0" r="6350" b="4445"/>
+            <wp:docPr id="5" name="图片 2" descr="IMG_256"/>
+            <wp:cNvGraphicFramePr>
+              <a:graphicFrameLocks xmlns:a="http://schemas.openxmlformats.org/drawingml/2006/main" noChangeAspect="1"/>
+            </wp:cNvGraphicFramePr>
+            <a:graphic xmlns:a="http://schemas.openxmlformats.org/drawingml/2006/main">
+              <a:graphicData uri="http://schemas.openxmlformats.org/drawingml/2006/picture">
+                <pic:pic xmlns:pic="http://schemas.openxmlformats.org/drawingml/2006/picture">
+                  <pic:nvPicPr>
+                    <pic:cNvPr id="5" name="图片 2" descr="IMG_256"/>
+                    <pic:cNvPicPr>
+                      <a:picLocks noChangeAspect="1"/>
+                    </pic:cNvPicPr>
+                  </pic:nvPicPr>
+                  <pic:blipFill>
+                    <a:blip r:embed="rId11"/>
+                    <a:stretch>
+                      <a:fillRect/>
+                    </a:stretch>
+                  </pic:blipFill>
+                  <pic:spPr>
+                    <a:xfrm>
+                      <a:off x="0" y="0"/>
+                      <a:ext cx="5266690" cy="2784475"/>
+                    </a:xfrm>
+                    <a:prstGeom prst="rect">
+                      <a:avLst/>
+                    </a:prstGeom>
+                    <a:noFill/>
+                    <a:ln w="9525">
+                      <a:noFill/>
+                    </a:ln>
                   </pic:spPr>
                 </pic:pic>
               </a:graphicData>
@@ -3604,23 +3990,226 @@
         <w:ind w:leftChars="100"/>
         <w:jc w:val="center"/>
         <w:rPr>
-          <w:rFonts w:hint="eastAsia" w:ascii="楷体" w:hAnsi="楷体" w:eastAsia="楷体" w:cs="楷体"/>
-          <w:b/>
-          <w:bCs/>
-          <w:kern w:val="0"/>
+          <w:rFonts w:hint="eastAsia" w:ascii="宋体" w:hAnsi="宋体" w:eastAsia="宋体" w:cs="宋体"/>
+          <w:lang w:val="en-US" w:eastAsia="zh-CN"/>
+        </w:rPr>
+      </w:pPr>
+      <w:r>
+        <w:rPr>
+          <w:rFonts w:hint="eastAsia" w:ascii="宋体" w:hAnsi="宋体" w:eastAsia="宋体" w:cs="宋体"/>
+          <w:lang w:val="en-US" w:eastAsia="zh-CN"/>
+        </w:rPr>
+        <w:t>Figure 2-8 Recording &amp; Saving Interface</w:t>
+      </w:r>
+    </w:p>
+    <w:p>
+      <w:pPr>
+        <w:numPr>
+          <w:numId w:val="0"/>
+        </w:numPr>
+        <w:ind w:leftChars="0"/>
+        <w:rPr>
+          <w:rFonts w:hint="default" w:ascii="宋体" w:hAnsi="宋体" w:eastAsia="宋体" w:cs="宋体"/>
+          <w:sz w:val="24"/>
+          <w:szCs w:val="24"/>
+          <w:lang w:val="en-US" w:eastAsia="zh-CN"/>
+        </w:rPr>
+      </w:pPr>
+    </w:p>
+    <w:p>
+      <w:pPr>
+        <w:pStyle w:val="4"/>
+        <w:numPr>
+          <w:ilvl w:val="4"/>
+          <w:numId w:val="1"/>
+        </w:numPr>
+        <w:bidi w:val="0"/>
+        <w:spacing w:line="240" w:lineRule="auto"/>
+        <w:ind w:left="0" w:leftChars="0" w:firstLine="0" w:firstLineChars="0"/>
+        <w:outlineLvl w:val="3"/>
+        <w:rPr>
+          <w:rFonts w:hint="default" w:ascii="宋体" w:hAnsi="宋体" w:eastAsia="宋体" w:cs="宋体"/>
           <w:sz w:val="32"/>
           <w:szCs w:val="32"/>
+          <w:lang w:val="en-US" w:eastAsia="zh-CN"/>
+        </w:rPr>
+      </w:pPr>
+      <w:bookmarkStart w:id="13" w:name="_Toc30710"/>
+      <w:r>
+        <w:rPr>
+          <w:rFonts w:hint="default" w:ascii="宋体" w:hAnsi="宋体" w:eastAsia="宋体" w:cs="宋体"/>
+          <w:sz w:val="32"/>
+          <w:szCs w:val="32"/>
+          <w:lang w:val="en-US" w:eastAsia="zh-CN"/>
+        </w:rPr>
+        <w:t>Performance interface</w:t>
+      </w:r>
+      <w:bookmarkEnd w:id="13"/>
+    </w:p>
+    <w:p>
+      <w:pPr>
+        <w:ind w:firstLine="420" w:firstLineChars="0"/>
+        <w:rPr>
+          <w:rFonts w:hint="default" w:ascii="宋体" w:hAnsi="宋体" w:eastAsia="宋体" w:cs="宋体"/>
+          <w:sz w:val="24"/>
+          <w:szCs w:val="24"/>
+          <w:lang w:val="en-US" w:eastAsia="zh-CN"/>
+        </w:rPr>
+      </w:pPr>
+      <w:r>
+        <w:rPr>
+          <w:rFonts w:hint="default" w:ascii="宋体" w:hAnsi="宋体" w:eastAsia="宋体" w:cs="宋体"/>
+          <w:sz w:val="24"/>
+          <w:szCs w:val="24"/>
+          <w:lang w:val="en-US" w:eastAsia="zh-CN"/>
+        </w:rPr>
+        <w:t>It offers simple adjustment functions for Viewer performance.</w:t>
+      </w:r>
+    </w:p>
+    <w:p>
+      <w:pPr>
+        <w:ind w:firstLine="420" w:firstLineChars="0"/>
+        <w:rPr>
+          <w:rFonts w:hint="default" w:ascii="宋体" w:hAnsi="宋体" w:eastAsia="宋体" w:cs="宋体"/>
+          <w:sz w:val="24"/>
+          <w:szCs w:val="24"/>
+          <w:lang w:val="en-US" w:eastAsia="zh-CN"/>
+        </w:rPr>
+      </w:pPr>
+      <w:r>
+        <w:rPr>
+          <w:rFonts w:hint="eastAsia" w:ascii="宋体" w:hAnsi="宋体" w:eastAsia="宋体" w:cs="宋体"/>
+          <w:sz w:val="24"/>
+          <w:szCs w:val="24"/>
+          <w:lang w:val="en-US" w:eastAsia="zh-CN"/>
+        </w:rPr>
+        <w:t xml:space="preserve">- </w:t>
+      </w:r>
+      <w:r>
+        <w:rPr>
+          <w:rFonts w:hint="default" w:ascii="宋体" w:hAnsi="宋体" w:eastAsia="宋体" w:cs="宋体"/>
+          <w:sz w:val="24"/>
+          <w:szCs w:val="24"/>
+          <w:lang w:val="en-US" w:eastAsia="zh-CN"/>
+        </w:rPr>
+        <w:t>VSync: Allows setting the vertical synchronization option for the entire interface.</w:t>
+      </w:r>
+    </w:p>
+    <w:p>
+      <w:pPr>
+        <w:ind w:firstLine="420" w:firstLineChars="0"/>
+        <w:rPr>
+          <w:rFonts w:hint="default" w:ascii="宋体" w:hAnsi="宋体" w:eastAsia="宋体" w:cs="宋体"/>
+          <w:sz w:val="24"/>
+          <w:szCs w:val="24"/>
+          <w:lang w:val="en-US" w:eastAsia="zh-CN"/>
+        </w:rPr>
+      </w:pPr>
+      <w:r>
+        <w:rPr>
+          <w:rFonts w:hint="eastAsia" w:ascii="宋体" w:hAnsi="宋体" w:eastAsia="宋体" w:cs="宋体"/>
+          <w:sz w:val="24"/>
+          <w:szCs w:val="24"/>
+          <w:lang w:val="en-US" w:eastAsia="zh-CN"/>
+        </w:rPr>
+        <w:t xml:space="preserve">- </w:t>
+      </w:r>
+      <w:r>
+        <w:rPr>
+          <w:rFonts w:hint="default" w:ascii="宋体" w:hAnsi="宋体" w:eastAsia="宋体" w:cs="宋体"/>
+          <w:sz w:val="24"/>
+          <w:szCs w:val="24"/>
+          <w:lang w:val="en-US" w:eastAsia="zh-CN"/>
+        </w:rPr>
+        <w:t>UI Font Scale: Adjusts the font size of the entire interface by dragging the slider. Currently, it is limited to 80% to 150%.</w:t>
+      </w:r>
+    </w:p>
+    <w:p>
+      <w:pPr>
+        <w:keepNext w:val="0"/>
+        <w:keepLines w:val="0"/>
+        <w:widowControl/>
+        <w:suppressLineNumbers w:val="0"/>
+        <w:jc w:val="center"/>
+      </w:pPr>
+      <w:r>
+        <w:rPr>
+          <w:rFonts w:ascii="宋体" w:hAnsi="宋体" w:eastAsia="宋体" w:cs="宋体"/>
+          <w:kern w:val="0"/>
+          <w:sz w:val="24"/>
+          <w:szCs w:val="24"/>
           <w:lang w:val="en-US" w:eastAsia="zh-CN" w:bidi="ar"/>
         </w:rPr>
-      </w:pPr>
-      <w:r>
-        <w:rPr>
-          <w:rFonts w:hint="eastAsia" w:ascii="宋体" w:hAnsi="宋体" w:eastAsia="宋体" w:cs="宋体"/>
-          <w:lang w:val="en-US" w:eastAsia="zh-CN"/>
-        </w:rPr>
-        <w:t>Figure 2-7 Viewer settings interface</w:t>
-      </w:r>
-      <w:bookmarkStart w:id="11" w:name="_Toc29812"/>
+        <w:drawing>
+          <wp:inline distT="0" distB="0" distL="114300" distR="114300">
+            <wp:extent cx="5266690" cy="2789555"/>
+            <wp:effectExtent l="0" t="0" r="6350" b="6985"/>
+            <wp:docPr id="7" name="图片 3" descr="IMG_256"/>
+            <wp:cNvGraphicFramePr>
+              <a:graphicFrameLocks xmlns:a="http://schemas.openxmlformats.org/drawingml/2006/main" noChangeAspect="1"/>
+            </wp:cNvGraphicFramePr>
+            <a:graphic xmlns:a="http://schemas.openxmlformats.org/drawingml/2006/main">
+              <a:graphicData uri="http://schemas.openxmlformats.org/drawingml/2006/picture">
+                <pic:pic xmlns:pic="http://schemas.openxmlformats.org/drawingml/2006/picture">
+                  <pic:nvPicPr>
+                    <pic:cNvPr id="7" name="图片 3" descr="IMG_256"/>
+                    <pic:cNvPicPr>
+                      <a:picLocks noChangeAspect="1"/>
+                    </pic:cNvPicPr>
+                  </pic:nvPicPr>
+                  <pic:blipFill>
+                    <a:blip r:embed="rId12"/>
+                    <a:stretch>
+                      <a:fillRect/>
+                    </a:stretch>
+                  </pic:blipFill>
+                  <pic:spPr>
+                    <a:xfrm>
+                      <a:off x="0" y="0"/>
+                      <a:ext cx="5266690" cy="2789555"/>
+                    </a:xfrm>
+                    <a:prstGeom prst="rect">
+                      <a:avLst/>
+                    </a:prstGeom>
+                    <a:noFill/>
+                    <a:ln w="9525">
+                      <a:noFill/>
+                    </a:ln>
+                  </pic:spPr>
+                </pic:pic>
+              </a:graphicData>
+            </a:graphic>
+          </wp:inline>
+        </w:drawing>
+      </w:r>
+    </w:p>
+    <w:p>
+      <w:pPr>
+        <w:ind w:leftChars="100"/>
+        <w:jc w:val="center"/>
+        <w:rPr>
+          <w:rFonts w:hint="eastAsia" w:ascii="宋体" w:hAnsi="宋体" w:eastAsia="宋体" w:cs="宋体"/>
+          <w:lang w:val="en-US" w:eastAsia="zh-CN"/>
+        </w:rPr>
+      </w:pPr>
+      <w:r>
+        <w:rPr>
+          <w:rFonts w:hint="eastAsia" w:ascii="宋体" w:hAnsi="宋体" w:eastAsia="宋体" w:cs="宋体"/>
+          <w:lang w:val="en-US" w:eastAsia="zh-CN"/>
+        </w:rPr>
+        <w:t>Figure 2-9 Performance interface</w:t>
+      </w:r>
+    </w:p>
+    <w:p>
+      <w:pPr>
+        <w:ind w:firstLine="420" w:firstLineChars="0"/>
+        <w:rPr>
+          <w:rFonts w:hint="default" w:ascii="宋体" w:hAnsi="宋体" w:eastAsia="宋体" w:cs="宋体"/>
+          <w:sz w:val="24"/>
+          <w:szCs w:val="24"/>
+          <w:lang w:val="en-US" w:eastAsia="zh-CN"/>
+        </w:rPr>
+      </w:pPr>
     </w:p>
     <w:p>
       <w:pPr>
@@ -3640,7 +4229,7 @@
           <w:lang w:val="en-US" w:eastAsia="zh-CN"/>
         </w:rPr>
       </w:pPr>
-      <w:bookmarkStart w:id="12" w:name="_Toc2657"/>
+      <w:bookmarkStart w:id="14" w:name="_Toc25790"/>
       <w:r>
         <w:rPr>
           <w:rFonts w:hint="eastAsia" w:ascii="楷体" w:hAnsi="楷体" w:eastAsia="楷体" w:cs="楷体"/>
@@ -3687,7 +4276,7 @@
         </w:rPr>
         <w:t>Image Preview Area Overview</w:t>
       </w:r>
-      <w:bookmarkEnd w:id="12"/>
+      <w:bookmarkEnd w:id="14"/>
     </w:p>
     <w:p>
       <w:pPr>
@@ -3764,7 +4353,7 @@
                     </pic:cNvPicPr>
                   </pic:nvPicPr>
                   <pic:blipFill>
-                    <a:blip r:embed="rId11"/>
+                    <a:blip r:embed="rId13"/>
                     <a:stretch>
                       <a:fillRect/>
                     </a:stretch>
@@ -3810,7 +4399,7 @@
           <w:rFonts w:hint="eastAsia" w:ascii="宋体" w:hAnsi="宋体" w:eastAsia="宋体" w:cs="宋体"/>
           <w:lang w:val="en-US" w:eastAsia="zh-CN"/>
         </w:rPr>
-        <w:t>Figure 2-8 Image preview area</w:t>
+        <w:t>Figure 2-10 Image preview area</w:t>
       </w:r>
     </w:p>
     <w:p>
@@ -3846,7 +4435,7 @@
           <w:lang w:val="en-US" w:eastAsia="zh-CN"/>
         </w:rPr>
       </w:pPr>
-      <w:bookmarkStart w:id="13" w:name="_Toc7154"/>
+      <w:bookmarkStart w:id="15" w:name="_Toc21408"/>
       <w:r>
         <w:rPr>
           <w:rFonts w:hint="eastAsia" w:ascii="楷体" w:hAnsi="楷体" w:eastAsia="楷体" w:cs="楷体"/>
@@ -3892,7 +4481,7 @@
         </w:rPr>
         <w:t>Sensor Info Preview Area</w:t>
       </w:r>
-      <w:bookmarkEnd w:id="13"/>
+      <w:bookmarkEnd w:id="15"/>
     </w:p>
     <w:p>
       <w:pPr>
@@ -3913,15 +4502,33 @@
         </w:rPr>
         <w:t>Located at the bottom of the Looper Viewer main interface, it displays received sensor information in real time, including current reception frequency and the frequency displayed on the screen.</w:t>
       </w:r>
+    </w:p>
+    <w:p>
+      <w:pPr>
+        <w:ind w:leftChars="100"/>
+        <w:jc w:val="center"/>
+        <w:rPr>
+          <w:rFonts w:hint="eastAsia" w:ascii="宋体" w:hAnsi="宋体" w:eastAsia="宋体" w:cs="宋体"/>
+          <w:lang w:val="en-US" w:eastAsia="zh-CN"/>
+        </w:rPr>
+      </w:pPr>
       <w:r>
         <w:rPr>
           <w:rFonts w:hint="eastAsia"/>
           <w:lang w:val="en-US" w:eastAsia="zh-CN"/>
         </w:rPr>
         <w:drawing>
-          <wp:inline distT="0" distB="0" distL="114300" distR="114300">
+          <wp:anchor distT="0" distB="0" distL="114300" distR="114300" simplePos="0" relativeHeight="251668480" behindDoc="0" locked="0" layoutInCell="1" allowOverlap="1">
+            <wp:simplePos x="0" y="0"/>
+            <wp:positionH relativeFrom="column">
+              <wp:posOffset>1270</wp:posOffset>
+            </wp:positionH>
+            <wp:positionV relativeFrom="paragraph">
+              <wp:posOffset>130810</wp:posOffset>
+            </wp:positionV>
             <wp:extent cx="5271135" cy="726440"/>
             <wp:effectExtent l="0" t="0" r="1905" b="5080"/>
+            <wp:wrapTopAndBottom/>
             <wp:docPr id="18" name="图片 18" descr="{CD773A31-F0DA-4374-8492-1F8272B35C15}"/>
             <wp:cNvGraphicFramePr>
               <a:graphicFrameLocks xmlns:a="http://schemas.openxmlformats.org/drawingml/2006/main" noChangeAspect="1"/>
@@ -3936,7 +4543,7 @@
                     </pic:cNvPicPr>
                   </pic:nvPicPr>
                   <pic:blipFill>
-                    <a:blip r:embed="rId12"/>
+                    <a:blip r:embed="rId14"/>
                     <a:stretch>
                       <a:fillRect/>
                     </a:stretch>
@@ -3953,25 +4560,15 @@
                 </pic:pic>
               </a:graphicData>
             </a:graphic>
-          </wp:inline>
+          </wp:anchor>
         </w:drawing>
       </w:r>
-    </w:p>
-    <w:p>
-      <w:pPr>
-        <w:ind w:leftChars="100"/>
-        <w:jc w:val="center"/>
-        <w:rPr>
-          <w:rFonts w:hint="eastAsia" w:ascii="宋体" w:hAnsi="宋体" w:eastAsia="宋体" w:cs="宋体"/>
-          <w:lang w:val="en-US" w:eastAsia="zh-CN"/>
-        </w:rPr>
-      </w:pPr>
-      <w:r>
-        <w:rPr>
-          <w:rFonts w:hint="eastAsia" w:ascii="宋体" w:hAnsi="宋体" w:eastAsia="宋体" w:cs="宋体"/>
-          <w:lang w:val="en-US" w:eastAsia="zh-CN"/>
-        </w:rPr>
-        <w:t>Figure 2-9 Sensor Information Preview Area</w:t>
+      <w:r>
+        <w:rPr>
+          <w:rFonts w:hint="eastAsia" w:ascii="宋体" w:hAnsi="宋体" w:eastAsia="宋体" w:cs="宋体"/>
+          <w:lang w:val="en-US" w:eastAsia="zh-CN"/>
+        </w:rPr>
+        <w:t>Figure 2-11 Sensor Information Preview Area</w:t>
       </w:r>
     </w:p>
     <w:p>
@@ -3992,7 +4589,7 @@
           <w:lang w:val="en-US" w:eastAsia="zh-CN"/>
         </w:rPr>
       </w:pPr>
-      <w:bookmarkStart w:id="14" w:name="_Toc24384"/>
+      <w:bookmarkStart w:id="16" w:name="_Toc28345"/>
       <w:r>
         <w:rPr>
           <w:rFonts w:hint="eastAsia" w:ascii="楷体" w:hAnsi="楷体" w:eastAsia="楷体" w:cs="楷体"/>
@@ -4038,7 +4635,7 @@
         </w:rPr>
         <w:t>VIO Test Preview Area</w:t>
       </w:r>
-      <w:bookmarkEnd w:id="14"/>
+      <w:bookmarkEnd w:id="16"/>
     </w:p>
     <w:p>
       <w:pPr>
@@ -4103,7 +4700,7 @@
                     </pic:cNvPicPr>
                   </pic:nvPicPr>
                   <pic:blipFill>
-                    <a:blip r:embed="rId13"/>
+                    <a:blip r:embed="rId15"/>
                     <a:stretch>
                       <a:fillRect/>
                     </a:stretch>
@@ -4138,7 +4735,7 @@
           <w:rFonts w:hint="eastAsia" w:ascii="宋体" w:hAnsi="宋体" w:eastAsia="宋体" w:cs="宋体"/>
           <w:lang w:val="en-US" w:eastAsia="zh-CN"/>
         </w:rPr>
-        <w:t>Figure 2-10 VIO test preview area</w:t>
+        <w:t>Figure 2-12 VIO test preview area</w:t>
       </w:r>
     </w:p>
     <w:p>
@@ -4178,7 +4775,7 @@
           <w:lang w:val="en-US" w:eastAsia="zh-CN"/>
         </w:rPr>
       </w:pPr>
-      <w:bookmarkStart w:id="15" w:name="_Toc16964"/>
+      <w:bookmarkStart w:id="17" w:name="_Toc4064"/>
       <w:r>
         <w:rPr>
           <w:rFonts w:hint="eastAsia" w:ascii="楷体" w:hAnsi="楷体" w:eastAsia="楷体" w:cs="楷体"/>
@@ -4224,7 +4821,7 @@
         </w:rPr>
         <w:t>Control Panel Overview</w:t>
       </w:r>
-      <w:bookmarkEnd w:id="15"/>
+      <w:bookmarkEnd w:id="17"/>
     </w:p>
     <w:p>
       <w:pPr>
@@ -4282,7 +4879,7 @@
                     </pic:cNvPicPr>
                   </pic:nvPicPr>
                   <pic:blipFill>
-                    <a:blip r:embed="rId14"/>
+                    <a:blip r:embed="rId16"/>
                     <a:stretch>
                       <a:fillRect/>
                     </a:stretch>
@@ -4317,7 +4914,7 @@
           <w:rFonts w:hint="eastAsia" w:ascii="宋体" w:hAnsi="宋体" w:eastAsia="宋体" w:cs="宋体"/>
           <w:lang w:val="en-US" w:eastAsia="zh-CN"/>
         </w:rPr>
-        <w:t>Figure 2-11 Control panel</w:t>
+        <w:t>Figure 2-13 Control panel</w:t>
       </w:r>
     </w:p>
     <w:p>
@@ -4363,7 +4960,7 @@
           <w:lang w:val="en-US" w:eastAsia="zh-CN"/>
         </w:rPr>
       </w:pPr>
-      <w:bookmarkStart w:id="16" w:name="_Toc5022"/>
+      <w:bookmarkStart w:id="18" w:name="_Toc6144"/>
       <w:r>
         <w:rPr>
           <w:rFonts w:hint="eastAsia" w:ascii="楷体" w:hAnsi="楷体" w:eastAsia="楷体" w:cs="楷体"/>
@@ -4409,7 +5006,7 @@
         </w:rPr>
         <w:t>IMU Data Line Chart</w:t>
       </w:r>
-      <w:bookmarkEnd w:id="16"/>
+      <w:bookmarkEnd w:id="18"/>
     </w:p>
     <w:p>
       <w:pPr>
@@ -4454,7 +5051,7 @@
                     </pic:cNvPicPr>
                   </pic:nvPicPr>
                   <pic:blipFill>
-                    <a:blip r:embed="rId15"/>
+                    <a:blip r:embed="rId17"/>
                     <a:stretch>
                       <a:fillRect/>
                     </a:stretch>
@@ -4500,7 +5097,7 @@
           <w:rFonts w:hint="eastAsia" w:ascii="宋体" w:hAnsi="宋体" w:eastAsia="宋体" w:cs="宋体"/>
           <w:lang w:val="en-US" w:eastAsia="zh-CN"/>
         </w:rPr>
-        <w:t>Figure 2-12 IMU data line chart</w:t>
+        <w:t>Figure 2-14 IMU data line chart</w:t>
       </w:r>
     </w:p>
     <w:p>
@@ -4553,7 +5150,7 @@
           <w:lang w:val="en-US" w:eastAsia="zh-CN"/>
         </w:rPr>
       </w:pPr>
-      <w:bookmarkStart w:id="17" w:name="_Toc27857"/>
+      <w:bookmarkStart w:id="19" w:name="_Toc13333"/>
       <w:r>
         <w:rPr>
           <w:rFonts w:hint="eastAsia" w:ascii="黑体" w:hAnsi="黑体" w:eastAsia="黑体" w:cs="黑体"/>
@@ -4565,7 +5162,7 @@
         </w:rPr>
         <w:t>Download &amp; Installation</w:t>
       </w:r>
-      <w:bookmarkEnd w:id="17"/>
+      <w:bookmarkEnd w:id="19"/>
     </w:p>
     <w:p>
       <w:pPr>
@@ -4584,7 +5181,7 @@
           <w:lang w:val="en-US" w:eastAsia="zh-CN"/>
         </w:rPr>
       </w:pPr>
-      <w:bookmarkStart w:id="18" w:name="_Toc1056"/>
+      <w:bookmarkStart w:id="20" w:name="_Toc7401"/>
       <w:r>
         <w:rPr>
           <w:rFonts w:hint="eastAsia" w:ascii="楷体" w:hAnsi="楷体" w:eastAsia="楷体" w:cs="楷体"/>
@@ -4594,7 +5191,7 @@
         </w:rPr>
         <w:t>Download</w:t>
       </w:r>
-      <w:bookmarkEnd w:id="18"/>
+      <w:bookmarkEnd w:id="20"/>
     </w:p>
     <w:p>
       <w:pPr>
@@ -4824,7 +5421,7 @@
           <w:lang w:val="en-US" w:eastAsia="zh-CN"/>
         </w:rPr>
       </w:pPr>
-      <w:bookmarkStart w:id="19" w:name="_Toc30061"/>
+      <w:bookmarkStart w:id="21" w:name="_Toc23520"/>
       <w:r>
         <w:rPr>
           <w:rFonts w:hint="eastAsia" w:ascii="楷体" w:hAnsi="楷体" w:eastAsia="楷体" w:cs="楷体"/>
@@ -4834,7 +5431,7 @@
         </w:rPr>
         <w:t>Installation</w:t>
       </w:r>
-      <w:bookmarkEnd w:id="19"/>
+      <w:bookmarkEnd w:id="21"/>
     </w:p>
     <w:p>
       <w:pPr>
@@ -4854,7 +5451,7 @@
           <w:lang w:val="en-US" w:eastAsia="zh-CN"/>
         </w:rPr>
       </w:pPr>
-      <w:bookmarkStart w:id="20" w:name="_Toc23559"/>
+      <w:bookmarkStart w:id="22" w:name="_Toc24723"/>
       <w:r>
         <w:rPr>
           <w:rFonts w:hint="eastAsia" w:ascii="宋体" w:hAnsi="宋体" w:eastAsia="宋体" w:cs="宋体"/>
@@ -4864,7 +5461,7 @@
         </w:rPr>
         <w:t>Windows</w:t>
       </w:r>
-      <w:bookmarkEnd w:id="20"/>
+      <w:bookmarkEnd w:id="22"/>
     </w:p>
     <w:p>
       <w:pPr>
@@ -4919,7 +5516,7 @@
                     </pic:cNvPicPr>
                   </pic:nvPicPr>
                   <pic:blipFill>
-                    <a:blip r:embed="rId16"/>
+                    <a:blip r:embed="rId18"/>
                     <a:stretch>
                       <a:fillRect/>
                     </a:stretch>
@@ -5022,7 +5619,7 @@
           <w:lang w:val="en-US" w:eastAsia="zh-CN"/>
         </w:rPr>
       </w:pPr>
-      <w:bookmarkStart w:id="21" w:name="_Toc6182"/>
+      <w:bookmarkStart w:id="23" w:name="_Toc17380"/>
       <w:r>
         <w:rPr>
           <w:rFonts w:hint="eastAsia" w:ascii="宋体" w:hAnsi="宋体" w:eastAsia="宋体" w:cs="宋体"/>
@@ -5032,7 +5629,7 @@
         </w:rPr>
         <w:t>Linux</w:t>
       </w:r>
-      <w:bookmarkEnd w:id="21"/>
+      <w:bookmarkEnd w:id="23"/>
     </w:p>
     <w:p>
       <w:pPr>
@@ -5087,7 +5684,7 @@
                     </pic:cNvPicPr>
                   </pic:nvPicPr>
                   <pic:blipFill>
-                    <a:blip r:embed="rId17"/>
+                    <a:blip r:embed="rId19"/>
                     <a:stretch>
                       <a:fillRect/>
                     </a:stretch>
@@ -5211,7 +5808,7 @@
                     </pic:cNvPicPr>
                   </pic:nvPicPr>
                   <pic:blipFill>
-                    <a:blip r:embed="rId18"/>
+                    <a:blip r:embed="rId20"/>
                     <a:stretch>
                       <a:fillRect/>
                     </a:stretch>

</xml_diff>